<commit_message>
Use saurabh-shinde-2022-sms LinkedIn URL everywhere
Co-Authored-By: Claude Sonnet 5.5 <noreply@anthropic.com>
Claude-Session: https://claude.ai/code/session_01P2YhFfkPj9eGjKXVYuaio8
</commit_message>
<xml_diff>
--- a/dist/Saurabh_Shinde_AI_Engineer_Resume.docx
+++ b/dist/Saurabh_Shinde_AI_Engineer_Resume.docx
@@ -54,7 +54,7 @@
         <w:spacing w:after="30"/>
         <w:jc w:val="center"/>
       </w:pPr>
-      <w:hyperlink w:history="1" r:id="rIdil21_vk29-9drnk05izj0">
+      <w:hyperlink w:history="1" r:id="rIdivpt1hxmgidzb02za_rr6">
         <w:r>
           <w:rPr>
             <w:rFonts w:ascii="Calibri" w:cs="Calibri" w:eastAsia="Calibri" w:hAnsi="Calibri"/>
@@ -75,7 +75,7 @@
         </w:rPr>
         <w:t xml:space="preserve">   |   </w:t>
       </w:r>
-      <w:hyperlink w:history="1" r:id="rId3lo2tq0j9aucfl6yc0a12">
+      <w:hyperlink w:history="1" r:id="rIdqprxmlfsnexbgpzm62whb">
         <w:r>
           <w:rPr>
             <w:rFonts w:ascii="Calibri" w:cs="Calibri" w:eastAsia="Calibri" w:hAnsi="Calibri"/>
@@ -96,7 +96,7 @@
         </w:rPr>
         <w:t xml:space="preserve">   |   </w:t>
       </w:r>
-      <w:hyperlink w:history="1" r:id="rId1h_1s_dettwttgqzv3gfa">
+      <w:hyperlink w:history="1" r:id="rId_8v5rjgjlvvaszaqe8ib1">
         <w:r>
           <w:rPr>
             <w:rFonts w:ascii="Calibri" w:cs="Calibri" w:eastAsia="Calibri" w:hAnsi="Calibri"/>
@@ -1198,7 +1198,7 @@
         </w:rPr>
         <w:t xml:space="preserve">   </w:t>
       </w:r>
-      <w:hyperlink w:history="1" r:id="rIdazb46gnffax9kleptjj_6">
+      <w:hyperlink w:history="1" r:id="rIdr4hqa9ls8dgs2gvikaac7">
         <w:r>
           <w:rPr>
             <w:rFonts w:ascii="Calibri" w:cs="Calibri" w:eastAsia="Calibri" w:hAnsi="Calibri"/>
@@ -1512,7 +1512,7 @@
         </w:rPr>
         <w:t xml:space="preserve">   </w:t>
       </w:r>
-      <w:hyperlink w:history="1" r:id="rIdtaqn0jrufv8ftcp6p8glq">
+      <w:hyperlink w:history="1" r:id="rIdi2l23lbj6qowaqg_nd8ug">
         <w:r>
           <w:rPr>
             <w:rFonts w:ascii="Calibri" w:cs="Calibri" w:eastAsia="Calibri" w:hAnsi="Calibri"/>

</xml_diff>